<commit_message>
Add Meet Jess intro video with captions to The Cushion Challenge
56-second cut of the NotebookLM paper-craft video (script lines only,
end logo removed) plus a WebVTT captions track (A11Y-07) and a poster
frame. The video plays at the top of the game's Meet Jess screen with
preload none (PRF-01). Teacher's Guide and lesson plan now direct the
instructor to play it during the warm-up.

Co-Authored-By: Claude Opus 5.5 <noreply@anthropic.com>
Claude-Session: https://claude.ai/code/session_01RNbJ55jTfzjmrF14FV898r
</commit_message>
<xml_diff>
--- a/lesson-Money-Management/Teacher-Resources/Part2_Save_First_Lesson_Plan.docx
+++ b/lesson-Money-Management/Teacher-Resources/Part2_Save_First_Lesson_Plan.docx
@@ -615,6 +615,19 @@
     </w:p>
     <w:p>
       <w:pPr>
+        <w:spacing w:after="60" w:before="0" w:line="276"/>
+      </w:pPr>
+      <w:r>
+        <w:rPr>
+          <w:rFonts w:ascii="Segoe UI" w:cs="Segoe UI" w:eastAsia="Segoe UI" w:hAnsi="Segoe UI"/>
+          <w:sz w:val="20"/>
+          <w:szCs w:val="20"/>
+        </w:rPr>
+        <w:t xml:space="preserve">- Meet Jess video with captions: lesson-Money-Management/Meet_Jess.mp4 (plays inside the game)</w:t>
+      </w:r>
+    </w:p>
+    <w:p>
+      <w:pPr>
         <w:spacing w:after="40" w:before="160" w:line="276"/>
       </w:pPr>
       <w:r>
@@ -947,7 +960,7 @@
                 <w:sz w:val="20"/>
                 <w:szCs w:val="20"/>
               </w:rPr>
-              <w:t xml:space="preserve">Open The Cushion Challenge on the classroom screen and press Start over. Introduce Jess, a fictional mom of two who found work through SPOKES and still gets SNAP.</w:t>
+              <w:t xml:space="preserve">Open The Cushion Challenge on the classroom screen and press Start over. Play the one-minute Meet Jess video to introduce Jess, a fictional mom of two who found work through SPOKES and still gets SNAP.</w:t>
             </w:r>
           </w:p>
           <w:p>
@@ -1004,7 +1017,20 @@
                 <w:sz w:val="20"/>
                 <w:szCs w:val="20"/>
               </w:rPr>
-              <w:t xml:space="preserve">Projector or smart board</w:t>
+              <w:t xml:space="preserve">Video: Meet Jess (captioned)</w:t>
+            </w:r>
+          </w:p>
+          <w:p>
+            <w:pPr>
+              <w:spacing w:after="20" w:before="0" w:line="276"/>
+            </w:pPr>
+            <w:r>
+              <w:rPr>
+                <w:rFonts w:ascii="Segoe UI" w:cs="Segoe UI" w:eastAsia="Segoe UI" w:hAnsi="Segoe UI"/>
+                <w:sz w:val="20"/>
+                <w:szCs w:val="20"/>
+              </w:rPr>
+              <w:t xml:space="preserve">Projector or smart board, speakers</w:t>
             </w:r>
           </w:p>
         </w:tc>

</xml_diff>

<commit_message>
Add Class mode to The Cushion Challenge for projector teaching
Class mode (default): text scales for a projector or large monitor,
choices are lettered A-D (teacher can press the letter), and each
answer waits for a Reveal button so the class can discuss first.
The last screen points learners to the paper My First Step card.
Class mode off restores the laptop/phone single-player layout.
Teacher's Guide and lesson plan updated to match.

Co-Authored-By: Claude Opus 5.5 <noreply@anthropic.com>
Claude-Session: https://claude.ai/code/session_01RNbJ55jTfzjmrF14FV898r
</commit_message>
<xml_diff>
--- a/lesson-Money-Management/Teacher-Resources/Part2_Save_First_Lesson_Plan.docx
+++ b/lesson-Money-Management/Teacher-Resources/Part2_Save_First_Lesson_Plan.docx
@@ -960,7 +960,7 @@
                 <w:sz w:val="20"/>
                 <w:szCs w:val="20"/>
               </w:rPr>
-              <w:t xml:space="preserve">Open The Cushion Challenge on the classroom screen and press Start over. Play the one-minute Meet Jess video to introduce Jess, a fictional mom of two who found work through SPOKES and still gets SNAP.</w:t>
+              <w:t xml:space="preserve">Open The Cushion Challenge on the classroom screen, press Start over, and check that Class mode is On. Play the one-minute Meet Jess video to introduce Jess, a fictional mom of two who found work through SPOKES and still gets SNAP.</w:t>
             </w:r>
           </w:p>
           <w:p>
@@ -1127,7 +1127,20 @@
                 <w:sz w:val="20"/>
                 <w:szCs w:val="20"/>
               </w:rPr>
-              <w:t xml:space="preserve">Point to the cushion meter and the $250 goal line. Explain that the class will vote on Jess's choices for four paydays.</w:t>
+              <w:t xml:space="preserve">Point to the cushion meter and the $250 goal line. Explain that the class will vote on Jess's choices for four paydays by calling out a letter, A to D.</w:t>
+            </w:r>
+          </w:p>
+          <w:p>
+            <w:pPr>
+              <w:spacing w:after="120" w:before="0" w:line="276"/>
+            </w:pPr>
+            <w:r>
+              <w:rPr>
+                <w:rFonts w:ascii="Segoe UI" w:cs="Segoe UI" w:eastAsia="Segoe UI" w:hAnsi="Segoe UI"/>
+                <w:sz w:val="20"/>
+                <w:szCs w:val="20"/>
+              </w:rPr>
+              <w:t xml:space="preserve">For each vote: click the class's pick (or press its letter), ask one or two learners why, then click Reveal what happens.</w:t>
             </w:r>
           </w:p>
         </w:tc>
@@ -1665,7 +1678,7 @@
                 <w:sz w:val="20"/>
                 <w:szCs w:val="20"/>
               </w:rPr>
-              <w:t xml:space="preserve">Each learner chooses one private first step for this week on the game's last screen or the paper card. The amount line is optional, and cards are not collected.</w:t>
+              <w:t xml:space="preserve">The last screen lists five first steps. Each learner circles one on a paper My First Step card. The amount line is optional, and cards are not collected.</w:t>
             </w:r>
           </w:p>
         </w:tc>
@@ -1709,7 +1722,7 @@
                 <w:sz w:val="20"/>
                 <w:szCs w:val="20"/>
               </w:rPr>
-              <w:t xml:space="preserve">My First Step card</w:t>
+              <w:t xml:space="preserve">My First Step card (paper)</w:t>
             </w:r>
           </w:p>
         </w:tc>
@@ -1780,7 +1793,7 @@
           <w:sz w:val="20"/>
           <w:szCs w:val="20"/>
         </w:rPr>
-        <w:t xml:space="preserve">- One-on-one or virtual: the learner plays the same page while the instructor talks through each pop-up; take votes in the chat.</w:t>
+        <w:t xml:space="preserve">- Class mode is on by default: large text for a projector, lettered choices, and answers that wait for the teacher to reveal them. One-on-one: turn Class mode off. Virtual: keep it on, share your screen, and take letter votes in the chat.</w:t>
       </w:r>
     </w:p>
     <w:p>

</xml_diff>